<commit_message>
feat: complete resident and admin portal enhancements, AI services, docx templates, and emergency broadcast
</commit_message>
<xml_diff>
--- a/public/files/document-templates/Cert.-solo-parent-Templates.docx
+++ b/public/files/document-templates/Cert.-solo-parent-Templates.docx
@@ -1,6 +1,6 @@
 
 <file path=word/document.xml><?xml version="1.0" encoding="utf-8"?>
-<w:document xmlns:wpc="http://schemas.microsoft.com/office/word/2010/wordprocessingCanvas" xmlns:cx="http://schemas.microsoft.com/office/drawing/2014/chartex" xmlns:cx1="http://schemas.microsoft.com/office/drawing/2015/9/8/chartex" xmlns:cx2="http://schemas.microsoft.com/office/drawing/2015/10/21/chartex" xmlns:cx3="http://schemas.microsoft.com/office/drawing/2016/5/9/chartex" xmlns:cx4="http://schemas.microsoft.com/office/drawing/2016/5/10/chartex" xmlns:cx5="http://schemas.microsoft.com/office/drawing/2016/5/11/chartex" xmlns:cx6="http://schemas.microsoft.com/office/drawing/2016/5/12/chartex" xmlns:cx7="http://schemas.microsoft.com/office/drawing/2016/5/13/chartex" xmlns:cx8="http://schemas.microsoft.com/office/drawing/2016/5/14/chartex" xmlns:mc="http://schemas.openxmlformats.org/markup-compatibility/2006" xmlns:aink="http://schemas.microsoft.com/office/drawing/2016/ink" xmlns:am3d="http://schemas.microsoft.com/office/drawing/2017/model3d" xmlns:o="urn:schemas-microsoft-com:office:office" xmlns:r="http://schemas.openxmlformats.org/officeDocument/2006/relationships" xmlns:m="http://schemas.openxmlformats.org/officeDocument/2006/math" xmlns:v="urn:schemas-microsoft-com:vml" xmlns:wp14="http://schemas.microsoft.com/office/word/2010/wordprocessingDrawing" xmlns:wp="http://schemas.openxmlformats.org/drawingml/2006/wordprocessingDrawing" xmlns:w10="urn:schemas-microsoft-com:office:word" xmlns:w="http://schemas.openxmlformats.org/wordprocessingml/2006/main" xmlns:w14="http://schemas.microsoft.com/office/word/2010/wordml" xmlns:w15="http://schemas.microsoft.com/office/word/2012/wordml" xmlns:w16cid="http://schemas.microsoft.com/office/word/2016/wordml/cid" xmlns:w16se="http://schemas.microsoft.com/office/word/2015/wordml/symex" xmlns:wpg="http://schemas.microsoft.com/office/word/2010/wordprocessingGroup" xmlns:wpi="http://schemas.microsoft.com/office/word/2010/wordprocessingInk" xmlns:wne="http://schemas.microsoft.com/office/word/2006/wordml" xmlns:wps="http://schemas.microsoft.com/office/word/2010/wordprocessingShape" mc:Ignorable="w14 w15 w16se w16cid wp14">
+<w:document xmlns:ns1="http://schemas.openxmlformats.org/markup-compatibility/2006" xmlns:ns3="http://schemas.openxmlformats.org/drawingml/2006/wordprocessingDrawing" xmlns:ns4="http://schemas.microsoft.com/office/word/2010/wordprocessingDrawing" xmlns:ns5="http://schemas.openxmlformats.org/drawingml/2006/main" xmlns:ns6="http://schemas.openxmlformats.org/drawingml/2006/picture" xmlns:ns8="http://schemas.microsoft.com/office/drawing/2010/main" xmlns:r="http://schemas.openxmlformats.org/officeDocument/2006/relationships" xmlns:w="http://schemas.openxmlformats.org/wordprocessingml/2006/main" xmlns:w14="http://schemas.microsoft.com/office/word/2010/wordml" ns1:Ignorable="w14 w15 w16se w16cid wp14">
   <w:body>
     <w:p>
       <w:pPr>
@@ -18,63 +18,63 @@
           <w:noProof/>
         </w:rPr>
         <w:drawing>
-          <wp:anchor distT="0" distB="0" distL="114300" distR="114300" simplePos="0" relativeHeight="251658240" behindDoc="0" locked="0" layoutInCell="1" allowOverlap="1" wp14:anchorId="192F5FC4" wp14:editId="3DBDB1AD">
-            <wp:simplePos x="0" y="0"/>
-            <wp:positionH relativeFrom="margin">
-              <wp:posOffset>492981</wp:posOffset>
-            </wp:positionH>
-            <wp:positionV relativeFrom="paragraph">
-              <wp:posOffset>-90914</wp:posOffset>
-            </wp:positionV>
-            <wp:extent cx="795130" cy="753047"/>
-            <wp:effectExtent l="0" t="0" r="5080" b="9525"/>
-            <wp:wrapNone/>
-            <wp:docPr id="1" name="Picture 1" descr="logo upper ming"/>
-            <wp:cNvGraphicFramePr>
-              <a:graphicFrameLocks xmlns:a="http://schemas.openxmlformats.org/drawingml/2006/main" noChangeAspect="1"/>
-            </wp:cNvGraphicFramePr>
-            <a:graphic xmlns:a="http://schemas.openxmlformats.org/drawingml/2006/main">
-              <a:graphicData uri="http://schemas.openxmlformats.org/drawingml/2006/picture">
-                <pic:pic xmlns:pic="http://schemas.openxmlformats.org/drawingml/2006/picture">
-                  <pic:nvPicPr>
-                    <pic:cNvPr id="0" name="Picture 2" descr="logo upper ming"/>
-                    <pic:cNvPicPr>
-                      <a:picLocks noChangeAspect="1" noChangeArrowheads="1"/>
-                    </pic:cNvPicPr>
-                  </pic:nvPicPr>
-                  <pic:blipFill>
-                    <a:blip r:embed="rId4" cstate="print">
-                      <a:extLst>
-                        <a:ext uri="{28A0092B-C50C-407E-A947-70E740481C1C}">
-                          <a14:useLocalDpi xmlns:a14="http://schemas.microsoft.com/office/drawing/2010/main" val="0"/>
-                        </a:ext>
-                      </a:extLst>
-                    </a:blip>
-                    <a:srcRect/>
-                    <a:stretch>
-                      <a:fillRect/>
-                    </a:stretch>
-                  </pic:blipFill>
-                  <pic:spPr bwMode="auto">
-                    <a:xfrm>
-                      <a:off x="0" y="0"/>
-                      <a:ext cx="804428" cy="761853"/>
-                    </a:xfrm>
-                    <a:prstGeom prst="rect">
-                      <a:avLst/>
-                    </a:prstGeom>
-                    <a:noFill/>
-                  </pic:spPr>
-                </pic:pic>
-              </a:graphicData>
-            </a:graphic>
-            <wp14:sizeRelH relativeFrom="page">
-              <wp14:pctWidth>0</wp14:pctWidth>
-            </wp14:sizeRelH>
-            <wp14:sizeRelV relativeFrom="page">
-              <wp14:pctHeight>0</wp14:pctHeight>
-            </wp14:sizeRelV>
-          </wp:anchor>
+          <ns3:anchor distT="0" distB="0" distL="114300" distR="114300" simplePos="0" relativeHeight="251658240" behindDoc="0" locked="0" layoutInCell="1" allowOverlap="1" ns4:anchorId="192F5FC4" ns4:editId="3DBDB1AD">
+            <ns3:simplePos x="0" y="0"/>
+            <ns3:positionH relativeFrom="margin">
+              <ns3:posOffset>492981</ns3:posOffset>
+            </ns3:positionH>
+            <ns3:positionV relativeFrom="paragraph">
+              <ns3:posOffset>-90914</ns3:posOffset>
+            </ns3:positionV>
+            <ns3:extent cx="795130" cy="753047"/>
+            <ns3:effectExtent l="0" t="0" r="5080" b="9525"/>
+            <ns3:wrapNone/>
+            <ns3:docPr id="1" name="Picture 1" descr="logo upper ming"/>
+            <ns3:cNvGraphicFramePr>
+              <ns5:graphicFrameLocks noChangeAspect="1"/>
+            </ns3:cNvGraphicFramePr>
+            <ns5:graphic>
+              <ns5:graphicData uri="http://schemas.openxmlformats.org/drawingml/2006/picture">
+                <ns6:pic>
+                  <ns6:nvPicPr>
+                    <ns6:cNvPr id="0" name="Picture 2" descr="logo upper ming"/>
+                    <ns6:cNvPicPr>
+                      <ns5:picLocks noChangeAspect="1" noChangeArrowheads="1"/>
+                    </ns6:cNvPicPr>
+                  </ns6:nvPicPr>
+                  <ns6:blipFill>
+                    <ns5:blip r:embed="rId4" cstate="print">
+                      <ns5:extLst>
+                        <ns5:ext uri="{28A0092B-C50C-407E-A947-70E740481C1C}">
+                          <ns8:useLocalDpi val="0"/>
+                        </ns5:ext>
+                      </ns5:extLst>
+                    </ns5:blip>
+                    <ns5:srcRect/>
+                    <ns5:stretch>
+                      <ns5:fillRect/>
+                    </ns5:stretch>
+                  </ns6:blipFill>
+                  <ns6:spPr bwMode="auto">
+                    <ns5:xfrm>
+                      <ns5:off x="0" y="0"/>
+                      <ns5:ext cx="804428" cy="761853"/>
+                    </ns5:xfrm>
+                    <ns5:prstGeom prst="rect">
+                      <ns5:avLst/>
+                    </ns5:prstGeom>
+                    <ns5:noFill/>
+                  </ns6:spPr>
+                </ns6:pic>
+              </ns5:graphicData>
+            </ns5:graphic>
+            <ns4:sizeRelH relativeFrom="page">
+              <ns4:pctWidth>0</ns4:pctWidth>
+            </ns4:sizeRelH>
+            <ns4:sizeRelV relativeFrom="page">
+              <ns4:pctHeight>0</ns4:pctHeight>
+            </ns4:sizeRelV>
+          </ns3:anchor>
         </w:drawing>
       </w:r>
       <w:r>
@@ -332,7 +332,7 @@
           <w:szCs w:val="28"/>
           <w:u w:val="single"/>
         </w:rPr>
-        <w:t xml:space="preserve">              </w:t>
+        <w:t xml:space="preserve">{{FULL_NAME}} </w:t>
       </w:r>
       <w:r>
         <w:rPr>
@@ -374,7 +374,7 @@
           <w:sz w:val="28"/>
           <w:szCs w:val="28"/>
         </w:rPr>
-        <w:t>single</w:t>
+        <w:t>{{CIVIL_STATUS}}</w:t>
       </w:r>
       <w:r>
         <w:rPr>
@@ -391,7 +391,7 @@
           <w:sz w:val="28"/>
           <w:szCs w:val="28"/>
         </w:rPr>
-        <w:t>married</w:t>
+        <w:t/>
       </w:r>
       <w:r>
         <w:rPr>
@@ -410,7 +410,7 @@
           <w:szCs w:val="28"/>
           <w:u w:val="single"/>
         </w:rPr>
-        <w:t>widow</w:t>
+        <w:t/>
       </w:r>
       <w:r>
         <w:rPr>
@@ -451,7 +451,7 @@
           <w:sz w:val="28"/>
           <w:szCs w:val="28"/>
         </w:rPr>
-        <w:t>Muslim</w:t>
+        <w:t>{{PUROK}}</w:t>
       </w:r>
       <w:r>
         <w:rPr>
@@ -559,23 +559,23 @@
           <w:sz w:val="28"/>
           <w:szCs w:val="28"/>
         </w:rPr>
-        <w:t xml:space="preserve">due to </w:t>
-      </w:r>
-      <w:r>
-        <w:rPr>
-          <w:rFonts w:ascii="Times New Roman" w:hAnsi="Times New Roman" w:cs="Times New Roman"/>
-          <w:sz w:val="28"/>
-          <w:szCs w:val="28"/>
-        </w:rPr>
-        <w:t>death of h</w:t>
-      </w:r>
-      <w:r>
-        <w:rPr>
-          <w:rFonts w:ascii="Times New Roman" w:hAnsi="Times New Roman" w:cs="Times New Roman"/>
-          <w:sz w:val="28"/>
-          <w:szCs w:val="28"/>
-        </w:rPr>
-        <w:t>er</w:t>
+        <w:t xml:space="preserve">due to {{SOLO_PARENT_REASON}} </w:t>
+      </w:r>
+      <w:r>
+        <w:rPr>
+          <w:rFonts w:ascii="Times New Roman" w:hAnsi="Times New Roman" w:cs="Times New Roman"/>
+          <w:sz w:val="28"/>
+          <w:szCs w:val="28"/>
+        </w:rPr>
+        <w:t/>
+      </w:r>
+      <w:r>
+        <w:rPr>
+          <w:rFonts w:ascii="Times New Roman" w:hAnsi="Times New Roman" w:cs="Times New Roman"/>
+          <w:sz w:val="28"/>
+          <w:szCs w:val="28"/>
+        </w:rPr>
+        <w:t/>
       </w:r>
       <w:r>
         <w:rPr>
@@ -591,7 +591,7 @@
           <w:sz w:val="28"/>
           <w:szCs w:val="28"/>
         </w:rPr>
-        <w:t>husband</w:t>
+        <w:t/>
       </w:r>
       <w:r>
         <w:rPr>
@@ -664,16 +664,16 @@
           <w:sz w:val="28"/>
           <w:szCs w:val="28"/>
         </w:rPr>
-        <w:t>2</w:t>
-      </w:r>
-      <w:r>
-        <w:rPr>
-          <w:rFonts w:ascii="Times New Roman" w:hAnsi="Times New Roman" w:cs="Times New Roman"/>
-          <w:b/>
-          <w:sz w:val="28"/>
-          <w:szCs w:val="28"/>
-        </w:rPr>
-        <w:t>0</w:t>
+        <w:t>{{DAY}}</w:t>
+      </w:r>
+      <w:r>
+        <w:rPr>
+          <w:rFonts w:ascii="Times New Roman" w:hAnsi="Times New Roman" w:cs="Times New Roman"/>
+          <w:b/>
+          <w:sz w:val="28"/>
+          <w:szCs w:val="28"/>
+        </w:rPr>
+        <w:t/>
       </w:r>
       <w:r>
         <w:rPr>
@@ -683,7 +683,7 @@
           <w:szCs w:val="28"/>
           <w:vertAlign w:val="superscript"/>
         </w:rPr>
-        <w:t>th</w:t>
+        <w:t/>
       </w:r>
       <w:r>
         <w:rPr>
@@ -728,7 +728,7 @@
           <w:szCs w:val="28"/>
           <w:u w:val="single"/>
         </w:rPr>
-        <w:t xml:space="preserve">           </w:t>
+        <w:t xml:space="preserve">{{MONTH}} {{YEAR}} </w:t>
       </w:r>
       <w:bookmarkStart w:id="0" w:name="_GoBack"/>
       <w:bookmarkEnd w:id="0"/>
@@ -929,7 +929,7 @@
           <w:sz w:val="28"/>
           <w:szCs w:val="28"/>
         </w:rPr>
-        <w:t>MAMERTO C. CLARITO</w:t>
+        <w:t>{{BARANGAY_CAPTAIN}}</w:t>
       </w:r>
     </w:p>
     <w:p>

</xml_diff>